<commit_message>
chore: strip client-specific (grain/nitrogen) content for open-source release
- docs: remove client project documents and neutralize grain/nitrogen references
- code: drop grain BOM template from project factory and frontend options
- fixtures: remove grain demo projects/packages/events; keep loan/test demos
- tests & e2e: migrate CEP scenarios to DeviceReading event model
- scripts: delete nitrogen seed scripts
- include pending deployment-domain work (targets/deployments/generations)
</commit_message>
<xml_diff>
--- a/docs/user-guides/DWX决策工作台-用户操作手册.docx
+++ b/docs/user-guides/DWX决策工作台-用户操作手册.docx
@@ -7090,7 +7090,7 @@
           <w:color w:val="000000"/>
           <w:sz w:val="24"/>
         </w:rPr>
-        <w:t>（4）选择基线 BOM：空白起步、从模板选（如贷款审批模板、风控模板、粮库温控模板），或从现有项目复制 BOM 和包结构；</w:t>
+        <w:t>（4）选择基线 BOM：空白起步、从模板选（如贷款审批模板、风控模板、仓储温控模板），或从现有项目复制 BOM 和包结构；</w:t>
       </w:r>
     </w:p>
     <w:p>
@@ -13212,7 +13212,7 @@
           <w:color w:val="000000"/>
           <w:sz w:val="24"/>
         </w:rPr>
-        <w:t>Release 只引用已发布版本，不读取未保存或未发布草稿；同一决策服务的版本号单调递增；非默认项目的 decisionService 必须以 项目ID/ 开头（如 project-xxx/grain-alarm），避免服务标识跨项目混用。</w:t>
+        <w:t>Release 只引用已发布版本，不读取未保存或未发布草稿；同一决策服务的版本号单调递增；非默认项目的 decisionService 必须以 项目ID/ 开头（如 project-xxx/demo-alarm），避免服务标识跨项目混用。</w:t>
       </w:r>
     </w:p>
     <w:p>

</xml_diff>